<commit_message>
Fix duplicated brand query and soften phone blocker in Yandex Maps TZ
- Remove duplicated "китай скул" transliteration in brand-search bullet
- Make the "no published phone on site" blocker conditional instead of
  asserting it as verified fact

Co-Authored-By: Claude Opus 4.8 <noreply@anthropic.com>
Claude-Session: https://claude.ai/code/session_01AZdmR3jWew6VFPq2LwYRCE
</commit_message>
<xml_diff>
--- a/content/tz-yandex-maps-cheklist.docx
+++ b/content/tz-yandex-maps-cheklist.docx
@@ -164,7 +164,7 @@
           <w:sz w:val="21"/>
           <w:szCs w:val="21"/>
         </w:rPr>
-        <w:t xml:space="preserve">Колдунчик «Организации» и брендовый поиск — «kitai school / китай скул / китай скул» и гео-запросы.</w:t>
+        <w:t xml:space="preserve">Колдунчик «Организации» и брендовый поиск — «kitai school / китай скул / китайская школа» и гео-запросы.</w:t>
       </w:r>
     </w:p>
     <w:p>
@@ -253,7 +253,7 @@
           <w:sz w:val="21"/>
           <w:szCs w:val="21"/>
         </w:rPr>
-        <w:t xml:space="preserve">Единый телефон. Сайт работает через заявку/обратный звонок. В карточке нужен рабочий номер с кнопкой «Позвонить» — без него теряется главное целевое действие и часть доверия. Желателен отдельный номер с коллтрекингом.</w:t>
+        <w:t xml:space="preserve">Единый телефон. Если на сайте номер не опубликован (только заявка / обратный звонок) — сверить это. В карточке нужен рабочий номер с кнопкой «Позвонить»: без него теряется главное целевое действие и часть доверия. Желателен отдельный номер с коллтрекингом.</w:t>
       </w:r>
     </w:p>
     <w:p>

</xml_diff>

<commit_message>
Update Yandex Maps TZ with real card facts from live card
- Add "current card state" fact-check snapshot (name is a domain, no address
  point / services in Moscow+Russia, phone present, schedule empty)
- Reframe the three blockers: card name (domain -> brand), empty schedule,
  confirm online/service-area status
- Phone +7 925 024-79-79 confirmed present; downgrade to call-button note
- Refresh A2 decisions table and client questions accordingly

Co-Authored-By: Claude Opus 4.8 <noreply@anthropic.com>
Claude-Session: https://claude.ai/code/session_01AZdmR3jWew6VFPq2LwYRCE
</commit_message>
<xml_diff>
--- a/content/tz-yandex-maps-cheklist.docx
+++ b/content/tz-yandex-maps-cheklist.docx
@@ -209,7 +209,121 @@
           <w:sz w:val="25"/>
           <w:szCs w:val="25"/>
         </w:rPr>
-        <w:t xml:space="preserve">Три решения ДО старта работ (блокеры)</w:t>
+        <w:t xml:space="preserve">Текущее состояние карточки (факт-чек на 30.07.2026)</w:t>
+      </w:r>
+    </w:p>
+    <w:p>
+      <w:pPr>
+        <w:spacing w:after="60" w:before="0" w:line="276"/>
+      </w:pPr>
+      <w:r>
+        <w:rPr>
+          <w:color w:val="595959"/>
+          <w:sz w:val="21"/>
+          <w:szCs w:val="21"/>
+        </w:rPr>
+        <w:t xml:space="preserve">Сверено по публичной карточке:</w:t>
+      </w:r>
+    </w:p>
+    <w:p>
+      <w:pPr>
+        <w:pStyle w:val="ListParagraph"/>
+        <w:numPr>
+          <w:ilvl w:val="0"/>
+          <w:numId w:val="1"/>
+        </w:numPr>
+        <w:spacing w:after="60" w:line="276"/>
+      </w:pPr>
+      <w:r>
+        <w:rPr>
+          <w:sz w:val="21"/>
+          <w:szCs w:val="21"/>
+        </w:rPr>
+        <w:t xml:space="preserve">Название карточки — «Kitai-school.ru» (домен, а не бренд).</w:t>
+      </w:r>
+    </w:p>
+    <w:p>
+      <w:pPr>
+        <w:pStyle w:val="ListParagraph"/>
+        <w:numPr>
+          <w:ilvl w:val="0"/>
+          <w:numId w:val="1"/>
+        </w:numPr>
+        <w:spacing w:after="60" w:line="276"/>
+      </w:pPr>
+      <w:r>
+        <w:rPr>
+          <w:sz w:val="21"/>
+          <w:szCs w:val="21"/>
+        </w:rPr>
+        <w:t xml:space="preserve">Статус — «Оказывает услуги в Москве и в России»: организация без адресной точки (пешего трафика нет).</w:t>
+      </w:r>
+    </w:p>
+    <w:p>
+      <w:pPr>
+        <w:pStyle w:val="ListParagraph"/>
+        <w:numPr>
+          <w:ilvl w:val="0"/>
+          <w:numId w:val="1"/>
+        </w:numPr>
+        <w:spacing w:after="60" w:line="276"/>
+      </w:pPr>
+      <w:r>
+        <w:rPr>
+          <w:sz w:val="21"/>
+          <w:szCs w:val="21"/>
+        </w:rPr>
+        <w:t xml:space="preserve">Телефон есть: +7 (925) 024-79-79. Сайт kitai-school.ru привязан.</w:t>
+      </w:r>
+    </w:p>
+    <w:p>
+      <w:pPr>
+        <w:pStyle w:val="ListParagraph"/>
+        <w:numPr>
+          <w:ilvl w:val="0"/>
+          <w:numId w:val="1"/>
+        </w:numPr>
+        <w:spacing w:after="60" w:line="276"/>
+      </w:pPr>
+      <w:r>
+        <w:rPr>
+          <w:sz w:val="21"/>
+          <w:szCs w:val="21"/>
+        </w:rPr>
+        <w:t xml:space="preserve">График работы — НЕ указан («График работы не указан»).</w:t>
+      </w:r>
+    </w:p>
+    <w:p>
+      <w:pPr>
+        <w:pStyle w:val="ListParagraph"/>
+        <w:numPr>
+          <w:ilvl w:val="0"/>
+          <w:numId w:val="1"/>
+        </w:numPr>
+        <w:spacing w:after="120" w:line="276"/>
+      </w:pPr>
+      <w:r>
+        <w:rPr>
+          <w:sz w:val="21"/>
+          <w:szCs w:val="21"/>
+        </w:rPr>
+        <w:t xml:space="preserve">Есть вкладки «Фото», «Отзывы», «Особенности» — наполнение сверить в кабинете.</w:t>
+      </w:r>
+    </w:p>
+    <w:p>
+      <w:pPr>
+        <w:pStyle w:val="Heading2"/>
+        <w:spacing w:after="120" w:before="240"/>
+      </w:pPr>
+      <w:r>
+        <w:rPr>
+          <w:b/>
+          <w:bCs/>
+          <w:color w:val="8F1418"/>
+          <w:sz w:val="25"/>
+          <w:szCs w:val="25"/>
+        </w:rPr>
+        <w:t xml:space="preserve">Три первоочередные правки (блокеры)</w:t>
       </w:r>
     </w:p>
     <w:p>
@@ -231,7 +345,7 @@
           <w:sz w:val="21"/>
           <w:szCs w:val="21"/>
         </w:rPr>
-        <w:t xml:space="preserve">Статус адреса в карточке (51878184580) — это реальный офлайн-класс/офис в Москве, куда приходят ученики, юридический адрес или школа полностью онлайн? От этого зависят рубрика, раздел «как добраться», точка на карте и возможность собирать отзывы «о посещении». Если офлайн-визитов нет — ведём как онлайн-школу, без обещания «приезжайте».</w:t>
+        <w:t xml:space="preserve">Название карточки. Сейчас стоит домен «Kitai-school.ru». Заменить на бренд, как ищут и узнают люди: «Kitai School — школа китайского языка» (точную форму сверить с правилами Яндекса и брендбуком). Домен в названии слабее для узнавания и брендового поиска.</w:t>
       </w:r>
     </w:p>
     <w:p>
@@ -253,7 +367,7 @@
           <w:sz w:val="21"/>
           <w:szCs w:val="21"/>
         </w:rPr>
-        <w:t xml:space="preserve">Единый телефон. Если на сайте номер не опубликован (только заявка / обратный звонок) — сверить это. В карточке нужен рабочий номер с кнопкой «Позвонить»: без него теряется главное целевое действие и часть доверия. Желателен отдельный номер с коллтрекингом.</w:t>
+        <w:t xml:space="preserve">График работы — не заполнен. Задать единый корректный график (для онлайн-школы это часы приёмной/администраторов) + исключения по праздникам и синхронизировать с сайтом. Сейчас блок пустой — это первое, что чинится.</w:t>
       </w:r>
     </w:p>
     <w:p>
@@ -275,7 +389,20 @@
           <w:sz w:val="21"/>
           <w:szCs w:val="21"/>
         </w:rPr>
-        <w:t xml:space="preserve">Единый график работы. Свести к одному корректному графику (для онлайн-школы это часы приёмной/администраторов) + исключения по праздникам; заодно синхронизировать с сайтом.</w:t>
+        <w:t xml:space="preserve">Статус точки. Карточка уже стоит как «оказывает услуги в Москве и в России» (без адреса и пешего трафика) — подтвердить, что это верно (онлайн-школа, офлайн-классов нет). От этого зависят рубрика и отсутствие раздела «как добраться». Если появится офлайн-класс — добавить адрес и точку на карте.</w:t>
+      </w:r>
+    </w:p>
+    <w:p>
+      <w:pPr>
+        <w:spacing w:after="120" w:before="60" w:line="276"/>
+      </w:pPr>
+      <w:r>
+        <w:rPr>
+          <w:color w:val="595959"/>
+          <w:sz w:val="21"/>
+          <w:szCs w:val="21"/>
+        </w:rPr>
+        <w:t xml:space="preserve">Телефон в карточке уже есть (+7 925 024-79-79) — остаётся проверить кнопку «Позвонить» и при желании завести отдельный номер под коллтрекинг.</w:t>
       </w:r>
     </w:p>
     <w:p>
@@ -1146,7 +1273,7 @@
                 <w:sz w:val="20"/>
                 <w:szCs w:val="20"/>
               </w:rPr>
-              <w:t xml:space="preserve">Статус точки: офлайн-класс / офис / юр-адрес / полностью онлайн</w:t>
+              <w:t xml:space="preserve">Название карточки: бренд вместо домена «Kitai-school.ru»</w:t>
             </w:r>
           </w:p>
         </w:tc>
@@ -1173,7 +1300,7 @@
                 <w:sz w:val="20"/>
                 <w:szCs w:val="20"/>
               </w:rPr>
-              <w:t xml:space="preserve">Рубрику, раздел «как добраться», отзывы о посещении (блокер 1)</w:t>
+              <w:t xml:space="preserve">Узнаваемость и брендовый поиск (блокер 1)</w:t>
             </w:r>
           </w:p>
         </w:tc>
@@ -1234,7 +1361,7 @@
                 <w:sz w:val="20"/>
                 <w:szCs w:val="20"/>
               </w:rPr>
-              <w:t xml:space="preserve">Единый телефон для карточки</w:t>
+              <w:t xml:space="preserve">График работы (сейчас не указан) + праздничные исключения</w:t>
             </w:r>
           </w:p>
         </w:tc>
@@ -1262,7 +1389,182 @@
                 <w:sz w:val="20"/>
                 <w:szCs w:val="20"/>
               </w:rPr>
-              <w:t xml:space="preserve">Кнопку «Позвонить»; желателен номер под коллтрекинг (блокер 2)</w:t>
+              <w:t xml:space="preserve">Заполнить пустой блок; синхронизировать с сайтом (блокер 2)</w:t>
+            </w:r>
+          </w:p>
+        </w:tc>
+      </w:tr>
+      <w:tr>
+        <w:tc>
+          <w:tcPr>
+            <w:tcW w:type="dxa" w:w="560"/>
+            <w:tcBorders>
+              <w:top w:val="single" w:color="D9BFC1" w:sz="4"/>
+              <w:left w:val="single" w:color="D9BFC1" w:sz="4"/>
+              <w:bottom w:val="single" w:color="D9BFC1" w:sz="4"/>
+              <w:right w:val="single" w:color="D9BFC1" w:sz="4"/>
+            </w:tcBorders>
+            <w:tcMar>
+              <w:top w:type="dxa" w:w="50"/>
+              <w:left w:type="dxa" w:w="100"/>
+              <w:bottom w:type="dxa" w:w="50"/>
+              <w:right w:type="dxa" w:w="100"/>
+            </w:tcMar>
+            <w:vAlign w:val="center"/>
+          </w:tcPr>
+          <w:p>
+            <w:pPr>
+              <w:jc w:val="center"/>
+            </w:pPr>
+            <w:r>
+              <w:rPr>
+                <w:sz w:val="20"/>
+                <w:szCs w:val="20"/>
+              </w:rPr>
+              <w:t xml:space="preserve">☐</w:t>
+            </w:r>
+          </w:p>
+        </w:tc>
+        <w:tc>
+          <w:tcPr>
+            <w:tcW w:type="dxa" w:w="4260"/>
+            <w:tcBorders>
+              <w:top w:val="single" w:color="D9BFC1" w:sz="4"/>
+              <w:left w:val="single" w:color="D9BFC1" w:sz="4"/>
+              <w:bottom w:val="single" w:color="D9BFC1" w:sz="4"/>
+              <w:right w:val="single" w:color="D9BFC1" w:sz="4"/>
+            </w:tcBorders>
+            <w:tcMar>
+              <w:top w:type="dxa" w:w="50"/>
+              <w:left w:type="dxa" w:w="100"/>
+              <w:bottom w:type="dxa" w:w="50"/>
+              <w:right w:type="dxa" w:w="100"/>
+            </w:tcMar>
+            <w:vAlign w:val="center"/>
+          </w:tcPr>
+          <w:p>
+            <w:r>
+              <w:rPr>
+                <w:sz w:val="20"/>
+                <w:szCs w:val="20"/>
+              </w:rPr>
+              <w:t xml:space="preserve">Подтвердить статус «услуги в Москве и России» (онлайн, без офлайн-класса)</w:t>
+            </w:r>
+          </w:p>
+        </w:tc>
+        <w:tc>
+          <w:tcPr>
+            <w:tcW w:type="dxa" w:w="4206"/>
+            <w:tcBorders>
+              <w:top w:val="single" w:color="D9BFC1" w:sz="4"/>
+              <w:left w:val="single" w:color="D9BFC1" w:sz="4"/>
+              <w:bottom w:val="single" w:color="D9BFC1" w:sz="4"/>
+              <w:right w:val="single" w:color="D9BFC1" w:sz="4"/>
+            </w:tcBorders>
+            <w:tcMar>
+              <w:top w:type="dxa" w:w="50"/>
+              <w:left w:type="dxa" w:w="100"/>
+              <w:bottom w:type="dxa" w:w="50"/>
+              <w:right w:type="dxa" w:w="100"/>
+            </w:tcMar>
+            <w:vAlign w:val="center"/>
+          </w:tcPr>
+          <w:p>
+            <w:r>
+              <w:rPr>
+                <w:sz w:val="20"/>
+                <w:szCs w:val="20"/>
+              </w:rPr>
+              <w:t xml:space="preserve">Рубрику и отсутствие раздела «как добраться» (блокер 3)</w:t>
+            </w:r>
+          </w:p>
+        </w:tc>
+      </w:tr>
+      <w:tr>
+        <w:tc>
+          <w:tcPr>
+            <w:tcW w:type="dxa" w:w="560"/>
+            <w:tcBorders>
+              <w:top w:val="single" w:color="D9BFC1" w:sz="4"/>
+              <w:left w:val="single" w:color="D9BFC1" w:sz="4"/>
+              <w:bottom w:val="single" w:color="D9BFC1" w:sz="4"/>
+              <w:right w:val="single" w:color="D9BFC1" w:sz="4"/>
+            </w:tcBorders>
+            <w:shd w:fill="F7E9EA" w:color="auto" w:val="clear"/>
+            <w:tcMar>
+              <w:top w:type="dxa" w:w="50"/>
+              <w:left w:type="dxa" w:w="100"/>
+              <w:bottom w:type="dxa" w:w="50"/>
+              <w:right w:type="dxa" w:w="100"/>
+            </w:tcMar>
+            <w:vAlign w:val="center"/>
+          </w:tcPr>
+          <w:p>
+            <w:pPr>
+              <w:jc w:val="center"/>
+            </w:pPr>
+            <w:r>
+              <w:rPr>
+                <w:sz w:val="20"/>
+                <w:szCs w:val="20"/>
+              </w:rPr>
+              <w:t xml:space="preserve">☐</w:t>
+            </w:r>
+          </w:p>
+        </w:tc>
+        <w:tc>
+          <w:tcPr>
+            <w:tcW w:type="dxa" w:w="4260"/>
+            <w:tcBorders>
+              <w:top w:val="single" w:color="D9BFC1" w:sz="4"/>
+              <w:left w:val="single" w:color="D9BFC1" w:sz="4"/>
+              <w:bottom w:val="single" w:color="D9BFC1" w:sz="4"/>
+              <w:right w:val="single" w:color="D9BFC1" w:sz="4"/>
+            </w:tcBorders>
+            <w:shd w:fill="F7E9EA" w:color="auto" w:val="clear"/>
+            <w:tcMar>
+              <w:top w:type="dxa" w:w="50"/>
+              <w:left w:type="dxa" w:w="100"/>
+              <w:bottom w:type="dxa" w:w="50"/>
+              <w:right w:type="dxa" w:w="100"/>
+            </w:tcMar>
+            <w:vAlign w:val="center"/>
+          </w:tcPr>
+          <w:p>
+            <w:r>
+              <w:rPr>
+                <w:sz w:val="20"/>
+                <w:szCs w:val="20"/>
+              </w:rPr>
+              <w:t xml:space="preserve">Кнопка «Позвонить» у номера +7 925 024-79-79; при желании — номер под коллтрекинг</w:t>
+            </w:r>
+          </w:p>
+        </w:tc>
+        <w:tc>
+          <w:tcPr>
+            <w:tcW w:type="dxa" w:w="4206"/>
+            <w:tcBorders>
+              <w:top w:val="single" w:color="D9BFC1" w:sz="4"/>
+              <w:left w:val="single" w:color="D9BFC1" w:sz="4"/>
+              <w:bottom w:val="single" w:color="D9BFC1" w:sz="4"/>
+              <w:right w:val="single" w:color="D9BFC1" w:sz="4"/>
+            </w:tcBorders>
+            <w:shd w:fill="F7E9EA" w:color="auto" w:val="clear"/>
+            <w:tcMar>
+              <w:top w:type="dxa" w:w="50"/>
+              <w:left w:type="dxa" w:w="100"/>
+              <w:bottom w:type="dxa" w:w="50"/>
+              <w:right w:type="dxa" w:w="100"/>
+            </w:tcMar>
+            <w:vAlign w:val="center"/>
+          </w:tcPr>
+          <w:p>
+            <w:r>
+              <w:rPr>
+                <w:sz w:val="20"/>
+                <w:szCs w:val="20"/>
+              </w:rPr>
+              <w:t xml:space="preserve">Главное целевое действие и замер звонков</w:t>
             </w:r>
           </w:p>
         </w:tc>
@@ -7027,7 +7329,7 @@
           <w:sz w:val="21"/>
           <w:szCs w:val="21"/>
         </w:rPr>
-        <w:t xml:space="preserve">Статус адреса в карточке 51878184580: офлайн-класс/офис в Москве, юр-адрес или школа полностью онлайн?</w:t>
+        <w:t xml:space="preserve">Утверждаем название карточки в бренд-форме («Kitai School — школа китайского языка») вместо домена?</w:t>
       </w:r>
     </w:p>
     <w:p>
@@ -7049,7 +7351,7 @@
           <w:sz w:val="21"/>
           <w:szCs w:val="21"/>
         </w:rPr>
-        <w:t xml:space="preserve">Единый телефон для карточки (можно отдельный, под коллтрекинг)?</w:t>
+        <w:t xml:space="preserve">Единый график работы приёмной/администраторов (сейчас в карточке не указан)?</w:t>
       </w:r>
     </w:p>
     <w:p>
@@ -7071,7 +7373,7 @@
           <w:sz w:val="21"/>
           <w:szCs w:val="21"/>
         </w:rPr>
-        <w:t xml:space="preserve">Единый график работы приёмной/администраторов?</w:t>
+        <w:t xml:space="preserve">Статус подтверждаем как онлайн (услуги в Москве и России, без офлайн-класса) — или офлайн-класс всё же есть?</w:t>
       </w:r>
     </w:p>
     <w:p>
@@ -7093,7 +7395,7 @@
           <w:sz w:val="21"/>
           <w:szCs w:val="21"/>
         </w:rPr>
-        <w:t xml:space="preserve">Есть ли уже подтверждённые права в кабинете Яндекс Бизнес и кто владелец карточки?</w:t>
+        <w:t xml:space="preserve">Нужен ли отдельный номер под коллтрекинг вместо +7 925 024-79-79?</w:t>
       </w:r>
     </w:p>
     <w:p>
@@ -7115,7 +7417,7 @@
           <w:sz w:val="21"/>
           <w:szCs w:val="21"/>
         </w:rPr>
-        <w:t xml:space="preserve">Готовность к платному продвижению и ориентир по бюджету?</w:t>
+        <w:t xml:space="preserve">Есть ли уже подтверждённые права в кабинете Яндекс Бизнес и кто владелец карточки?</w:t>
       </w:r>
     </w:p>
     <w:p>
@@ -7137,7 +7439,7 @@
           <w:sz w:val="21"/>
           <w:szCs w:val="21"/>
         </w:rPr>
-        <w:t xml:space="preserve">Кто ответственный за отзывы со стороны Kitai School и через какой канал отвечаем?</w:t>
+        <w:t xml:space="preserve">Готовность к платному продвижению и ориентир по бюджету?</w:t>
       </w:r>
     </w:p>
     <w:p>
@@ -7153,6 +7455,28 @@
           <w:szCs w:val="21"/>
         </w:rPr>
         <w:t xml:space="preserve">7. </w:t>
+      </w:r>
+      <w:r>
+        <w:rPr>
+          <w:sz w:val="21"/>
+          <w:szCs w:val="21"/>
+        </w:rPr>
+        <w:t xml:space="preserve">Кто ответственный за отзывы со стороны Kitai School и через какой канал отвечаем?</w:t>
+      </w:r>
+    </w:p>
+    <w:p>
+      <w:pPr>
+        <w:spacing w:after="80" w:line="276"/>
+      </w:pPr>
+      <w:r>
+        <w:rPr>
+          <w:b/>
+          <w:bCs/>
+          <w:color w:val="8F1418"/>
+          <w:sz w:val="21"/>
+          <w:szCs w:val="21"/>
+        </w:rPr>
+        <w:t xml:space="preserve">8. </w:t>
       </w:r>
       <w:r>
         <w:rPr>

</xml_diff>

<commit_message>
Reflect empty-card reality in Yandex Maps TZ fact-check
Card is essentially blank (only phone filled), so the fact-check now states
a from-zero setup: starting audit score ~0-5, fill every empty section per
the checklist first, and do not connect paid promotion until the card is
packaged.

Co-Authored-By: Claude Opus 4.8 <noreply@anthropic.com>
Claude-Session: https://claude.ai/code/session_01AZdmR3jWew6VFPq2LwYRCE
</commit_message>
<xml_diff>
--- a/content/tz-yandex-maps-cheklist.docx
+++ b/content/tz-yandex-maps-cheklist.docx
@@ -214,7 +214,21 @@
     </w:p>
     <w:p>
       <w:pPr>
-        <w:spacing w:after="60" w:before="0" w:line="276"/>
+        <w:spacing w:after="80" w:before="0" w:line="276"/>
+      </w:pPr>
+      <w:r>
+        <w:rPr>
+          <w:b/>
+          <w:bCs/>
+          <w:sz w:val="21"/>
+          <w:szCs w:val="21"/>
+        </w:rPr>
+        <w:t xml:space="preserve">Главный вывод: карточка практически пустая — заполнен только телефон. Это не оптимизация, а наполнение с нуля. Стартовый балл по 100-балльному аудиту ≈ 0–5, а значит потенциал роста максимальный.</w:t>
+      </w:r>
+    </w:p>
+    <w:p>
+      <w:pPr>
+        <w:spacing w:after="40" w:before="0" w:line="276"/>
       </w:pPr>
       <w:r>
         <w:rPr>
@@ -222,7 +236,7 @@
           <w:sz w:val="21"/>
           <w:szCs w:val="21"/>
         </w:rPr>
-        <w:t xml:space="preserve">Сверено по публичной карточке:</w:t>
+        <w:t xml:space="preserve">Что есть:</w:t>
       </w:r>
     </w:p>
     <w:p>
@@ -239,7 +253,37 @@
           <w:sz w:val="21"/>
           <w:szCs w:val="21"/>
         </w:rPr>
-        <w:t xml:space="preserve">Название карточки — «Kitai-school.ru» (домен, а не бренд).</w:t>
+        <w:t xml:space="preserve">Телефон: +7 (925) 024-79-79. Сайт kitai-school.ru привязан.</w:t>
+      </w:r>
+    </w:p>
+    <w:p>
+      <w:pPr>
+        <w:pStyle w:val="ListParagraph"/>
+        <w:numPr>
+          <w:ilvl w:val="0"/>
+          <w:numId w:val="1"/>
+        </w:numPr>
+        <w:spacing w:after="100" w:line="276"/>
+      </w:pPr>
+      <w:r>
+        <w:rPr>
+          <w:sz w:val="21"/>
+          <w:szCs w:val="21"/>
+        </w:rPr>
+        <w:t xml:space="preserve">Статус — «Оказывает услуги в Москве и в России»: организация без адресной точки (пешего трафика нет).</w:t>
+      </w:r>
+    </w:p>
+    <w:p>
+      <w:pPr>
+        <w:spacing w:after="40" w:before="0" w:line="276"/>
+      </w:pPr>
+      <w:r>
+        <w:rPr>
+          <w:color w:val="595959"/>
+          <w:sz w:val="21"/>
+          <w:szCs w:val="21"/>
+        </w:rPr>
+        <w:t xml:space="preserve">Чего нет (пустые разделы — фронт работ):</w:t>
       </w:r>
     </w:p>
     <w:p>
@@ -256,7 +300,7 @@
           <w:sz w:val="21"/>
           <w:szCs w:val="21"/>
         </w:rPr>
-        <w:t xml:space="preserve">Статус — «Оказывает услуги в Москве и в России»: организация без адресной точки (пешего трафика нет).</w:t>
+        <w:t xml:space="preserve">Название — домен «Kitai-school.ru» вместо бренда.</w:t>
       </w:r>
     </w:p>
     <w:p>
@@ -273,7 +317,7 @@
           <w:sz w:val="21"/>
           <w:szCs w:val="21"/>
         </w:rPr>
-        <w:t xml:space="preserve">Телефон есть: +7 (925) 024-79-79. Сайт kitai-school.ru привязан.</w:t>
+        <w:t xml:space="preserve">График работы — не указан.</w:t>
       </w:r>
     </w:p>
     <w:p>
@@ -290,7 +334,7 @@
           <w:sz w:val="21"/>
           <w:szCs w:val="21"/>
         </w:rPr>
-        <w:t xml:space="preserve">График работы — НЕ указан («График работы не указан»).</w:t>
+        <w:t xml:space="preserve">Рубрики/категории, услуги/прайс, витрина, описание, «Особенности» — не заполнены (сверить в кабинете).</w:t>
       </w:r>
     </w:p>
     <w:p>
@@ -300,14 +344,29 @@
           <w:ilvl w:val="0"/>
           <w:numId w:val="1"/>
         </w:numPr>
-        <w:spacing w:after="120" w:line="276"/>
+        <w:spacing w:after="100" w:line="276"/>
       </w:pPr>
       <w:r>
         <w:rPr>
           <w:sz w:val="21"/>
           <w:szCs w:val="21"/>
         </w:rPr>
-        <w:t xml:space="preserve">Есть вкладки «Фото», «Отзывы», «Особенности» — наполнение сверить в кабинете.</w:t>
+        <w:t xml:space="preserve">Фото, Stories, отзывы — по факту пусто или почти пусто.</w:t>
+      </w:r>
+    </w:p>
+    <w:p>
+      <w:pPr>
+        <w:spacing w:after="120" w:before="0" w:line="276"/>
+      </w:pPr>
+      <w:r>
+        <w:rPr>
+          <w:i/>
+          <w:iCs/>
+          <w:color w:val="595959"/>
+          <w:sz w:val="21"/>
+          <w:szCs w:val="21"/>
+        </w:rPr>
+        <w:t xml:space="preserve">Следствие по методике: сначала упаковка по чек-листу ниже, и только потом — подписка/платный разгон. Реклама на пустую карточку даёт обратный эффект (высокий отказ → карточка проваливается ниже, чем была).</w:t>
       </w:r>
     </w:p>
     <w:p>

</xml_diff>